<commit_message>
Update the project report with the noise-conditional ensemble results
Co-Authored-By: Claude Opus 5.5 <noreply@anthropic.com>
</commit_message>
<xml_diff>
--- a/docs/MIRAGE_Project_Report.docx
+++ b/docs/MIRAGE_Project_Report.docx
@@ -216,7 +216,7 @@
                 <w:sz w:val="34"/>
                 <w:szCs w:val="34"/>
               </w:rPr>
-              <w:t xml:space="preserve">40 / 42</w:t>
+              <w:t xml:space="preserve">41 / 42</w:t>
             </w:r>
           </w:p>
           <w:p>
@@ -1679,7 +1679,7 @@
                 <w:sz w:val="20"/>
                 <w:szCs w:val="20"/>
               </w:rPr>
-              <w:t xml:space="preserve">Red-team: 40/42 laundered voice attacks and 15/15 image attacks caught; both misses were heavy street noise.</w:t>
+              <w:t xml:space="preserve">Red-team: 41/42 laundered voice attacks and 15/15 image attacks caught; the one miss is heavy street noise.</w:t>
             </w:r>
           </w:p>
           <w:p>
@@ -1698,7 +1698,7 @@
                 <w:sz w:val="20"/>
                 <w:szCs w:val="20"/>
               </w:rPr>
-              <w:t xml:space="preserve">Noise study (n = 90 clips): DF_Arena alone keeps AUC 0.961 at 5 dB street noise, while the two-model ensemble falls to 0.938.</w:t>
+              <w:t xml:space="preserve">Noise study (n = 90 clips): DF_Arena alone keeps AUC 0.961 at 5 dB street noise vs 0.938 for the two-model ensemble, so noisy audio is now scored by DF_Arena alone (noisy fakes caught at 10 dB: 27 → 43 of 50).</w:t>
             </w:r>
           </w:p>
           <w:p>
@@ -16929,7 +16929,7 @@
           <w:sz w:val="21"/>
           <w:szCs w:val="21"/>
         </w:rPr>
-        <w:t xml:space="preserve">Every laundering channel was caught except street noise at 10 dB SNR (4 of 6). Two fixes were tested and rejected: denoising erased the artefacts the detectors rely on, and lowering the threshold flagged 11 of 120 noisy real voices. The shipped behaviour is honest: below 19 dB SNR the voice evidence is reported as uncertain, and an uncertain voice asking for money or a code is still rated HIGH.</w:t>
+        <w:t xml:space="preserve">Every laundering channel is caught except street noise at 10 dB SNR, now 5 of 6 (4 of 6 before the noise-conditional ensemble in 6.3). Two earlier fixes were tested and rejected: denoising erased the artefacts the detectors rely on, and lowering the threshold flagged 11 of 120 noisy real voices. Noisy voice evidence is still reported as weak, and an uncertain voice asking for money or a code is still rated HIGH.</w:t>
       </w:r>
     </w:p>
     <w:p>
@@ -17114,7 +17114,7 @@
                 <w:sz w:val="20"/>
                 <w:szCs w:val="20"/>
               </w:rPr>
-              <w:t xml:space="preserve">The data therefore supports a </w:t>
+              <w:t xml:space="preserve">MIRAGE now uses a </w:t>
             </w:r>
             <w:r>
               <w:rPr>
@@ -17134,7 +17134,21 @@
                 <w:sz w:val="20"/>
                 <w:szCs w:val="20"/>
               </w:rPr>
-              <w:t xml:space="preserve">: trust DF_Arena alone when the measured SNR is low. This is the next change to the voice witness; it uses no training, only measured weighting.</w:t>
+              <w:t xml:space="preserve">: below 19 dB SNR, DF_Arena alone scores the audio. No training, only measured weighting.</w:t>
+            </w:r>
+          </w:p>
+          <w:p>
+            <w:pPr>
+              <w:spacing w:after="70" w:line="288"/>
+            </w:pPr>
+            <w:r>
+              <w:rPr>
+                <w:rFonts w:ascii="Calibri" w:cs="Calibri" w:eastAsia="Calibri" w:hAnsi="Calibri"/>
+                <w:color w:val="1F2937"/>
+                <w:sz w:val="20"/>
+                <w:szCs w:val="20"/>
+              </w:rPr>
+              <w:t xml:space="preserve">Measured trade-off at the decision point (≥ 0.9): at 10 dB, noisy fakes caught rose from 27 to 43 of 50 while real voices flagged rose from 0 to 1 of 40; at 5 dB, 19 → 44 of 50 caught and 0 → 4 of 40 real flagged. The red-team voice campaign went from 40/42 to 41/42.</w:t>
             </w:r>
           </w:p>
         </w:tc>
@@ -17990,7 +18004,7 @@
                 <w:sz w:val="20"/>
                 <w:szCs w:val="20"/>
               </w:rPr>
-              <w:t xml:space="preserve">Heavy noise: handled as uncertainty today; the noise-conditional ensemble is the measured next step.</w:t>
+              <w:t xml:space="preserve">Heavy noise: the noise-conditional ensemble catches far more fakes but flags about 1 in 40 real voices at 10 dB and 4 in 40 at 5 dB, so noisy evidence stays marked weak.</w:t>
             </w:r>
           </w:p>
           <w:p>
@@ -19663,7 +19677,7 @@
                 <w:sz w:val="18"/>
                 <w:szCs w:val="18"/>
               </w:rPr>
-              <w:t xml:space="preserve">Noise-conditional voice ensemble</w:t>
+              <w:t xml:space="preserve">Noise-robust voice beyond DF_Arena</w:t>
             </w:r>
           </w:p>
         </w:tc>
@@ -19695,7 +19709,7 @@
                 <w:sz w:val="18"/>
                 <w:szCs w:val="18"/>
               </w:rPr>
-              <w:t xml:space="preserve">Measured: DF_Arena alone holds best in noise (section 6.3)</w:t>
+              <w:t xml:space="preserve">Shipped: noise-conditional ensemble; next, a second noise-robust model to restore a two-model vote in noise</w:t>
             </w:r>
           </w:p>
         </w:tc>

</xml_diff>